<commit_message>
docs: formalize author list, academic affiliation and citation format in manuscript and documentation
</commit_message>
<xml_diff>
--- a/Articulo_Cientifico_Q1_Completo.docx
+++ b/Articulo_Cientifico_Q1_Completo.docx
@@ -40,7 +40,15 @@
           <w:b/>
           <w:sz w:val="22"/>
         </w:rPr>
-        <w:t>Yoel Armando Solórzano Sánchez¹*</w:t>
+        <w:t xml:space="preserve">Daily Ashley Córdova Urbina¹*, </w:t>
+      </w:r>
+      <w:r>
+        <w:rPr>
+          <w:rFonts w:ascii="Times New Roman" w:hAnsi="Times New Roman"/>
+          <w:b/>
+          <w:sz w:val="22"/>
+        </w:rPr>
+        <w:t>Yoel Armando Solórzano Sánchez¹</w:t>
       </w:r>
     </w:p>
     <w:p>
@@ -54,9 +62,13 @@
           <w:color w:val="64748B"/>
           <w:sz w:val="19"/>
         </w:rPr>
-        <w:t>¹ Departamento de Informática, Facultad de Ciencias Físicas y Matemáticas, Universidad Nacional de Trujillo, Av. Juan Pablo II s/n, Trujillo 13011, Perú.</w:t>
+        <w:t>¹ Escuela Académico Profesional de Ingeniería de Sistemas, Facultad de Ingeniería, Universidad Nacional de Trujillo, Av. Juan Pablo II s/n, Trujillo 13011, Perú.</w:t>
         <w:br/>
-        <w:t>* Autor de correspondencia: ysolorzano@unitru.edu.pe</w:t>
+        <w:t>• Daily Ashley Córdova Urbina — ORCID iD: https://orcid.org/0009-0008-8433-779X | Correo: T1043300421@unitru.edu.pe</w:t>
+        <w:br/>
+        <w:t>• Yoel Armando Solórzano Sánchez — ORCID iD: https://orcid.org/0009-0003-4245-7439 | Correo: ysolorzano@unitru.edu.pe</w:t>
+        <w:br/>
+        <w:t>* Autor de correspondencia: T1043300421@unitru.edu.pe</w:t>
       </w:r>
     </w:p>
     <w:p>
@@ -2501,7 +2513,7 @@
           <w:color w:val="1E293B"/>
           <w:sz w:val="22"/>
         </w:rPr>
-        <w:t>La arquitectura del sistema (Figura 1) fue concebida conforme al marco de referencia de gemelos digitales ciberfísicos en ingeniería ambiental (Tao et al., 2020), desacoplada en cuatro capas interoperables: (1) Capa de Ingesta y Asimilación de Datos Ciberfísicos; (2) Capa de Normalización e Imputación Continua (src/gd/serie.ts); (3) Capa de Modelado Físico y Renderizado 3D WebGL (src/components/DigitalTwin3DCanvas.tsx); y (4) Capa de Inferencia Predictiva y Explicabilidad Biofísica (src/gd/prediccion.ts, gd_python/aquatwin/motor/). La comunicación intermodular se gestiona mediante arquitecturas reactivas TypeScript en frontend conectadas mediante sockets RESTful bidireccionales con el microservicio analítico en Python 3.12 (FastAPI).</w:t>
+        <w:t>La arquitectura del sistema (Figura 1) fue concebida conforme al marco de referencia de gemelos digitales ciberfísicos en ingeniería ambiental (Tao et al., 2020), desacoplada en cuatro capas interoperables: (1) Capa de Ingesta y Asimilación de Datos Ciberfísicos; (2) Capa de Normalización e Imputación Continua de series temporales; (3) Capa de Modelado Físico y Renderizado 3D en WebGL; y (4) Capa de Inferencia Predictiva y Explicabilidad Biofísica. La comunicación intermodular se gestiona mediante arquitecturas reactivas en frontend conectadas mediante sockets y protocolos de comunicación bidireccionales con el microservicio analítico en Python 3.12.</w:t>
       </w:r>
     </w:p>
     <w:p>
@@ -3979,7 +3991,7 @@
           <w:color w:val="1E293B"/>
           <w:sz w:val="22"/>
         </w:rPr>
-        <w:t>En el archivo fuente [DigitalTwin3DCanvas.tsx](file:///c:/Users/crema/Downloads/aquatwin-hab---3d-digital-twin/src/components/DigitalTwin3DCanvas.tsx#L535-L580), la simulación de la masa de agua abandona la suposición tradicional de plano bidimensional estático. La elevación superficial libre de la malla hídrica η(u, v, t) se resuelve mediante una superposición multiharmónica de ondas gravitocilindricas forzadas por la tensión de cizallamiento del viento U_10:</w:t>
+        <w:t>En el módulo de simulación hidrodinámica tridimensional del Gemelo Digital (AquaTwin HAB, implementado en WebGL y Three.js), la simulación de la masa de agua abandona la suposición tradicional de plano bidimensional estático. La elevación superficial libre de la malla hídrica η(u, v, t) se resuelve mediante una superposición multiharmónica de ondas gravitocilindricas forzadas por la tensión de cizallamiento del viento U_10:</w:t>
         <w:br/>
         <w:br/>
         <w:t>η(u, v, t) = A₁ · sin(k₁ u + ω₁ t) + A₂ · cos(k₂ v + ω₂ t) + A₃ · sin(k₃(u + v) + ω₃ t)        (3)</w:t>
@@ -5537,7 +5549,7 @@
           <w:color w:val="1E293B"/>
           <w:sz w:val="22"/>
         </w:rPr>
-        <w:t>El motor predictivo (src/gd/prediccion.ts y gd_python/aquatwin/motor/prediccion.py) supera la dicotomía entre modelos puramente físicos y algoritmos puramente estadísticos mediante una arquitectura híbrida de dos niveles informada por la física (Physics-Informed ML; Willard et al., 2021). En el primer nivel, un motor limnológico determinista evalúa la estabilidad térmica de la columna de agua calculando el Índice de Estado Trófico de Carlson (TSI) y el gradiente térmico epilimnio-hipolimnio ΔT:</w:t>
+        <w:t>El motor predictivo del Gemelo Digital supera la dicotomía entre modelos puramente físicos y algoritmos puramente estadísticos mediante una arquitectura híbrida de dos niveles informada por la física (Physics-Informed ML; Willard et al., 2021). En el primer nivel, un motor limnológico determinista evalúa la estabilidad térmica de la columna de agua calculando el Índice de Estado Trófico de Carlson (TSI) y el gradiente térmico epilimnio-hipolimnio ΔT:</w:t>
         <w:br/>
         <w:br/>
         <w:t>TSI(Chl-a) = 9.81 · ln(Chl-a) + 30.6                                                          (6)</w:t>
@@ -10285,7 +10297,7 @@
           <w:color w:val="1E293B"/>
           <w:sz w:val="22"/>
         </w:rPr>
-        <w:t>A diferencia de los modelos puramente estocásticos de caja negra basados en redes neuronales profundas (e.g., LSTMs o transformadores no informados), que tienden a sobreajustar en periodos de transición estacional o predecir picos de crecimiento biológico imposibles sin soporte energético (Willard et al., 2021), la inclusión de las reglas deterministas limnológicas (ecuaciones 6 y 7 en src/gd/reglas.ts) impone cotas biofísicas estrictas. Esto explica por qué el ensamble AquaTwin retiene un R² de 0.816 a +72 horas (Tabla 4), mientras que la regresión estocástica colapsa a R² = 0.648. De igual forma, la atribución causal mediante valores SHAP (Figura 5) proporciona a los gestores de embalses un argumento objetivo y transparente: las alertas emitidas no son un número arbitrario, sino la consecuencia cuantificada del desacoplamiento entre radiación solar y turbulencia de viento.</w:t>
+        <w:t>A diferencia de los modelos puramente estocásticos de caja negra basados en redes neuronales profundas (e.g., LSTMs o transformadores no informados), que tienden a sobreajustar en periodos de transición estacional o predecir picos de crecimiento biológico imposibles sin soporte energético (Willard et al., 2021), la inclusión de las reglas deterministas limnológicas (ecuaciones 6 y 7 del subsistema de diagnóstico físico) impone cotas biofísicas estrictas. Esto explica por qué el ensamble AquaTwin retiene un R² de 0.816 a +72 horas (Tabla 4), mientras que la regresión estocástica colapsa a R² = 0.648. De igual forma, la atribución causal mediante valores SHAP (Figura 5) proporciona a los gestores de embalses un argumento objetivo y transparente: las alertas emitidas no son un número arbitrario, sino la consecuencia cuantificada del desacoplamiento entre radiación solar y turbulencia de viento.</w:t>
       </w:r>
     </w:p>
     <w:p>
@@ -11038,7 +11050,7 @@
         <w:color w:val="94A3B8"/>
         <w:sz w:val="17"/>
       </w:rPr>
-      <w:t>Solorzano-Sanchez et al. (2026) — Gemelo Digital Limnológico para Alerta Temprana de HABs</w:t>
+      <w:t>Córdova-Urbina &amp; Solórzano-Sánchez (2026) — Gemelo Digital Limnológico para Alerta Temprana de HABs</w:t>
     </w:r>
   </w:p>
 </w:ftr>
@@ -11058,7 +11070,7 @@
         <w:color w:val="64748B"/>
         <w:sz w:val="17"/>
       </w:rPr>
-      <w:t>Water Research / Environmental Modelling &amp; Software — Manuscript (Q1)</w:t>
+      <w:t>Water Research / Environmental Modelling &amp; Software — Manuscript Draft (Q1)</w:t>
     </w:r>
   </w:p>
 </w:hdr>

</xml_diff>